<commit_message>
Los .docx de Daniel se quedan en el repositorio
Entraron sin querer en f9df892: al subir los HTML regenerados hice «git add speechs/» y se
llevo los siete Word, que hasta entonces estaban fuera a proposito.

Daniel decide dejarlos. Dos consecuencias, y las dos las sabe:

- Estan publicados en el repositorio publico. No añade exposicion real: son los mismos guiones
  que ya estan publicados en markdown y en HTML.
- A cambio, sus ediciones y las mias pasan a tener historial y copia de seguridad, que era una
  de las cosas que echabamos de menos desde que empezamos a editarlos los dos.

Este commit ademas pone al dia los tres que tenian cambios sin subir: FJC (socios a 120.000),
FEC (todos los arreglos de la auditoria) y FPM (idem).

Co-Authored-By: Claude Opus 5 <noreply@anthropic.com>
</commit_message>
<xml_diff>
--- a/speechs/SPEECH FUNDACIÓN ESPAÑOLA DEL CORAZÓN.docx
+++ b/speechs/SPEECH FUNDACIÓN ESPAÑOLA DEL CORAZÓN.docx
@@ -723,15 +723,12 @@
       </w:r>
     </w:p>
     <w:p>
-      <w:pPr>
-        <w:ind w:left="708"/>
-      </w:pPr>
-      <w:r>
-        <w:rPr>
-          <w:b/>
-          <w:bCs/>
-        </w:rPr>
-        <w:t>Hoy, Ariadna tiene registrados más de 29.000 desfibriladores y más de 71.000 voluntarios.</w:t>
+      <w:r>
+        <w:rPr>
+          <w:b/>
+          <w:bCs/>
+        </w:rPr>
+        <w:t xml:space="preserve">Hoy, Ariadna tiene registrados más de 28.000 desfibriladores y más de 9.000 personas formadas y dispuestas a acudir.</w:t>
       </w:r>
     </w:p>
     <w:p>
@@ -1198,7 +1195,7 @@
         <w:ind w:left="708"/>
       </w:pPr>
       <w:r>
-        <w:t>Cada cuatro minutos en España muere alguien por una enfermedad cardiovascular.</w:t>
+        <w:t>Cada cinco minutos en España muere alguien por una enfermedad cardiovascular.</w:t>
       </w:r>
     </w:p>
     <w:p>

</xml_diff>